<commit_message>
Update 8-phase project document
</commit_message>
<xml_diff>
--- a/docs/PocketSmart_AI_8_Phase_Project_Document.docx
+++ b/docs/PocketSmart_AI_8_Phase_Project_Document.docx
@@ -12057,22 +12057,35 @@
           <w:iCs w:val="1"/>
         </w:rPr>
       </w:pPr>
-      <w:r>
-        <w:rPr>
-          <w:b w:val="1"/>
-          <w:bCs w:val="1"/>
-          <w:rtl w:val="0"/>
-        </w:rPr>
-        <w:t xml:space="preserve">Demo Video:</w:t>
-        <w:br w:type="textWrapping"/>
-      </w:r>
-      <w:r>
-        <w:rPr>
-          <w:i w:val="1"/>
-          <w:iCs w:val="1"/>
-          <w:rtl w:val="0"/>
-        </w:rPr>
-        <w:t xml:space="preserve">Google Drive link to be added after the final demo video is uploaded and sharing is set to “Anyone with the link”.</w:t>
+      <w:hyperlink r:id="rId9">
+        <w:r>
+          <w:rPr>
+            <w:b w:val="1"/>
+            <w:bCs w:val="1"/>
+            <w:color w:val="1155cc"/>
+            <w:u w:val="single"/>
+            <w:rtl w:val="0"/>
+          </w:rPr>
+          <w:t xml:space="preserve">Demo Video:</w:t>
+          <w:br w:type="textWrapping"/>
+        </w:r>
+      </w:hyperlink>
+      <w:hyperlink r:id="rId10">
+        <w:r>
+          <w:rPr>
+            <w:i w:val="1"/>
+            <w:iCs w:val="1"/>
+            <w:color w:val="1155cc"/>
+            <w:u w:val="single"/>
+            <w:rtl w:val="0"/>
+          </w:rPr>
+          <w:t xml:space="preserve">https://drive.google.com/file/d/1itOsMtzHtROM5RPIvZFcqQ5J5lyGip1g/view?usp=drivesdk</w:t>
+        </w:r>
+      </w:hyperlink>
+      <w:r>
+        <w:rPr>
+          <w:rtl w:val="0"/>
+        </w:rPr>
       </w:r>
     </w:p>
     <w:p>

</xml_diff>